<commit_message>
Cut the honor pack to 330 words and the note to 96
Nine sections, four tables and a claim-by-claim provenance table for the
citation were true but unasked for. Sourcing every phrase reads as
pre-defending it and listing five ways to refuse reads as anticipating
refusal.

What survives: the citation, what the Honor is, the certificate, what
becomes public, the agency-clearance note, and the link. The citation
lost its closing sentence, which praised the programme rather than her.

Co-Authored-By: Claude Opus 5 <noreply@anthropic.com>
Claude-Session: https://claude.ai/code/session_01W9UtE7X76spacWeSvBH7tv
</commit_message>
<xml_diff>
--- a/research/Message_Stacy_Young_Reply_2026-08-08b.docx
+++ b/research/Message_Stacy_Young_Reply_2026-08-08b.docx
@@ -27,13 +27,7 @@
         <w:spacing w:after="140"/>
       </w:pPr>
       <w:r>
-        <w:rPr>
-          <w:b/>
-        </w:rPr>
-        <w:t xml:space="preserve">What is left to send:</w:t>
-      </w:r>
-      <w:r>
-        <w:t xml:space="preserve"> the honor materials only. The Council drafts have already gone to her. She already has the manuscript. Her line about the blind review is agreement, not a request.</w:t>
+        <w:t xml:space="preserve">Council drafts already sent. She has the manuscript. Only the honor materials are outstanding.</w:t>
       </w:r>
     </w:p>
     <w:p>
@@ -56,31 +50,31 @@
         <w:spacing w:after="140"/>
       </w:pPr>
       <w:r>
-        <w:t xml:space="preserve">Here are the honor materials, to go with the Council drafts you already have.</w:t>
-      </w:r>
-    </w:p>
-    <w:p>
-      <w:pPr>
-        <w:spacing w:after="140"/>
-      </w:pPr>
-      <w:r>
-        <w:t xml:space="preserve">The citation is in there word for word, with a table showing where every factual claim in it comes from, what the acceptance page asks you, and what would become public and what never would. A draft certificate in your name is attached so you can see it rather than picture it. If any of the citation reads as overstated, say so and it changes.</w:t>
-      </w:r>
-    </w:p>
-    <w:p>
-      <w:pPr>
-        <w:spacing w:after="140"/>
-      </w:pPr>
-      <w:r>
-        <w:t xml:space="preserve">There is also a short section on agency clearance, in case HPD or the Conflicts of Interest Board would want to look at it. No money moves in either direction, this project has never held a contract with the City, and your title does not have to appear at all if your agency would rather it did not. If clearance takes time, take the time.</w:t>
-      </w:r>
-    </w:p>
-    <w:p>
-      <w:pPr>
-        <w:spacing w:after="140"/>
-      </w:pPr>
-      <w:r>
-        <w:t xml:space="preserve">Nothing is submitted, issued, or published until you have approved the manuscript, the Council notes, and the honor separately.</w:t>
+        <w:t xml:space="preserve">Here are the honor materials.</w:t>
+      </w:r>
+    </w:p>
+    <w:p>
+      <w:pPr>
+        <w:spacing w:after="140"/>
+      </w:pPr>
+      <w:r>
+        <w:t xml:space="preserve">The citation is in there word for word, along with a draft of the certificate. If any of it reads as overstated, tell me and I will change it.</w:t>
+      </w:r>
+    </w:p>
+    <w:p>
+      <w:pPr>
+        <w:spacing w:after="140"/>
+      </w:pPr>
+      <w:r>
+        <w:t xml:space="preserve">There is also a short note in case HPD or the Conflicts of Interest Board want to see it. No money moves in either direction, and your title does not have to appear at all if your agency would rather it did not.</w:t>
+      </w:r>
+    </w:p>
+    <w:p>
+      <w:pPr>
+        <w:spacing w:after="140"/>
+      </w:pPr>
+      <w:r>
+        <w:t xml:space="preserve">Nothing goes out in your name until you say so.</w:t>
       </w:r>
     </w:p>
     <w:p>
@@ -105,6 +99,45 @@
       </w:pPr>
       <w:r>
         <w:t xml:space="preserve">Attachments</w:t>
+      </w:r>
+    </w:p>
+    <w:p>
+      <w:pPr>
+        <w:numPr>
+          <w:ilvl w:val="0"/>
+          <w:numId w:val="1"/>
+        </w:numPr>
+        <w:spacing w:after="60"/>
+      </w:pPr>
+      <w:r>
+        <w:rPr>
+          <w:rFonts w:ascii="Consolas" w:hAnsi="Consolas"/>
+        </w:rPr>
+        <w:t xml:space="preserve">Honor_Materials_For_Stacy_Review_2026-08-08.docx</w:t>
+      </w:r>
+    </w:p>
+    <w:p>
+      <w:pPr>
+        <w:numPr>
+          <w:ilvl w:val="0"/>
+          <w:numId w:val="1"/>
+        </w:numPr>
+        <w:spacing w:after="60"/>
+      </w:pPr>
+      <w:r>
+        <w:rPr>
+          <w:rFonts w:ascii="Consolas" w:hAnsi="Consolas"/>
+        </w:rPr>
+        <w:t xml:space="preserve">DRAFT_Honor_Certificate_Stacy_Young.pdf</w:t>
+      </w:r>
+    </w:p>
+    <w:p>
+      <w:pPr>
+        <w:pStyle w:val="Heading2"/>
+        <w:spacing w:after="140"/>
+      </w:pPr>
+      <w:r>
+        <w:t xml:space="preserve">Held</w:t>
       </w:r>
     </w:p>
     <w:tbl>
@@ -147,130 +180,7 @@
               <w:spacing w:after="0"/>
             </w:pPr>
             <w:r>
-              <w:t xml:space="preserve">Why it is going</w:t>
-            </w:r>
-          </w:p>
-        </w:tc>
-      </w:tr>
-      <w:tr>
-        <w:tc>
-          <w:tcPr>
-            <w:tcW w:w="4680" w:type="dxa"/>
-          </w:tcPr>
-          <w:p>
-            <w:pPr>
-              <w:spacing w:after="0"/>
-            </w:pPr>
-            <w:r>
-              <w:rPr>
-                <w:rFonts w:ascii="Consolas" w:hAnsi="Consolas"/>
-              </w:rPr>
-              <w:t xml:space="preserve">Honor_Materials_For_Stacy_Review_2026-08-08.docx</w:t>
-            </w:r>
-          </w:p>
-        </w:tc>
-        <w:tc>
-          <w:tcPr>
-            <w:tcW w:w="4680" w:type="dxa"/>
-          </w:tcPr>
-          <w:p>
-            <w:pPr>
-              <w:spacing w:after="0"/>
-            </w:pPr>
-            <w:r>
-              <w:t xml:space="preserve">She asked for the honor materials. This is the only outstanding item</w:t>
-            </w:r>
-          </w:p>
-        </w:tc>
-      </w:tr>
-      <w:tr>
-        <w:tc>
-          <w:tcPr>
-            <w:tcW w:w="4680" w:type="dxa"/>
-          </w:tcPr>
-          <w:p>
-            <w:pPr>
-              <w:spacing w:after="0"/>
-            </w:pPr>
-            <w:r>
-              <w:rPr>
-                <w:rFonts w:ascii="Consolas" w:hAnsi="Consolas"/>
-              </w:rPr>
-              <w:t xml:space="preserve">DRAFT_Honor_Certificate_Stacy_Young.pdf</w:t>
-            </w:r>
-          </w:p>
-        </w:tc>
-        <w:tc>
-          <w:tcPr>
-            <w:tcW w:w="4680" w:type="dxa"/>
-          </w:tcPr>
-          <w:p>
-            <w:pPr>
-              <w:spacing w:after="0"/>
-            </w:pPr>
-            <w:r>
-              <w:t xml:space="preserve">Part of the honor materials; she should see it, not imagine it</w:t>
-            </w:r>
-          </w:p>
-        </w:tc>
-      </w:tr>
-    </w:tbl>
-    <w:p>
-      <w:pPr/>
-      <w:r>
-        <w:t/>
-      </w:r>
-    </w:p>
-    <w:p>
-      <w:pPr>
-        <w:pStyle w:val="Heading2"/>
-        <w:spacing w:after="140"/>
-      </w:pPr>
-      <w:r>
-        <w:t xml:space="preserve">Not going with this message, and why</w:t>
-      </w:r>
-    </w:p>
-    <w:tbl>
-      <w:tblPr>
-        <w:tblStyle w:val="TableGrid"/>
-        <w:tblW w:w="9360" w:type="dxa"/>
-        <w:tblBorders>
-          <w:top w:val="single" w:sz="4" w:space="0" w:color="999999"/>
-          <w:left w:val="single" w:sz="4" w:space="0" w:color="999999"/>
-          <w:bottom w:val="single" w:sz="4" w:space="0" w:color="999999"/>
-          <w:right w:val="single" w:sz="4" w:space="0" w:color="999999"/>
-          <w:insideH w:val="single" w:sz="4" w:space="0" w:color="999999"/>
-          <w:insideV w:val="single" w:sz="4" w:space="0" w:color="999999"/>
-        </w:tblBorders>
-      </w:tblPr>
-      <w:tblGrid>
-        <w:gridCol w:w="4680"/>
-        <w:gridCol w:w="4680"/>
-      </w:tblGrid>
-      <w:tr>
-        <w:tc>
-          <w:tcPr>
-            <w:tcW w:w="4680" w:type="dxa"/>
-          </w:tcPr>
-          <w:p>
-            <w:pPr>
-              <w:spacing w:after="0"/>
-            </w:pPr>
-            <w:r>
-              <w:t xml:space="preserve">File</w:t>
-            </w:r>
-          </w:p>
-        </w:tc>
-        <w:tc>
-          <w:tcPr>
-            <w:tcW w:w="4680" w:type="dxa"/>
-          </w:tcPr>
-          <w:p>
-            <w:pPr>
-              <w:spacing w:after="0"/>
-            </w:pPr>
-            <w:r>
-              <w:t xml:space="preserve">Reason held</w:t>
+              <w:t xml:space="preserve">Why</w:t>
             </w:r>
           </w:p>
         </w:tc>
@@ -301,7 +211,7 @@
               <w:spacing w:after="0"/>
             </w:pPr>
             <w:r>
-              <w:t xml:space="preserve">Already sent to her</w:t>
+              <w:t xml:space="preserve">Already sent</w:t>
             </w:r>
           </w:p>
         </w:tc>
@@ -332,7 +242,7 @@
               <w:spacing w:after="0"/>
             </w:pPr>
             <w:r>
-              <w:t xml:space="preserve">She already has it and is reading it</w:t>
+              <w:t xml:space="preserve">She has it</w:t>
             </w:r>
           </w:p>
         </w:tc>
@@ -363,7 +273,7 @@
               <w:spacing w:after="0"/>
             </w:pPr>
             <w:r>
-              <w:t xml:space="preserve">Goes to the second reader she names, not to her</w:t>
+              <w:t xml:space="preserve">Goes to the second reader she names</w:t>
             </w:r>
           </w:p>
         </w:tc>
@@ -394,7 +304,7 @@
               <w:spacing w:after="0"/>
             </w:pPr>
             <w:r>
-              <w:t xml:space="preserve">Never sent to anyone. Contains the original reads and outcomes</w:t>
+              <w:t xml:space="preserve">Never sent to anyone</w:t>
             </w:r>
           </w:p>
         </w:tc>
@@ -422,7 +332,7 @@
               <w:spacing w:after="0"/>
             </w:pPr>
             <w:r>
-              <w:t xml:space="preserve">Raise these only if she asks about them in her review. She said she would read carefully; pre-empting that reads as steering her review</w:t>
+              <w:t xml:space="preserve">Only if she raises them</w:t>
             </w:r>
           </w:p>
         </w:tc>

</xml_diff>